<commit_message>
save file and add some ehnacements
</commit_message>
<xml_diff>
--- a/03_correlation_coefficient/correlation_coefficient_algorithm.docx
+++ b/03_correlation_coefficient/correlation_coefficient_algorithm.docx
@@ -266,6 +266,163 @@
         </w:rPr>
       </w:pPr>
     </w:p>
+    <w:tbl>
+      <w:tblPr>
+        <w:tblStyle w:val="TableGrid"/>
+        <w:tblW w:w="0" w:type="auto"/>
+        <w:tblLook w:val="04A0" w:firstRow="1" w:lastRow="0" w:firstColumn="1" w:lastColumn="0" w:noHBand="0" w:noVBand="1"/>
+      </w:tblPr>
+      <w:tblGrid>
+        <w:gridCol w:w="846"/>
+        <w:gridCol w:w="9682"/>
+      </w:tblGrid>
+      <w:tr>
+        <w:tc>
+          <w:tcPr>
+            <w:tcW w:w="846" w:type="dxa"/>
+          </w:tcPr>
+          <w:p>
+            <w:pPr>
+              <w:rPr>
+                <w:rFonts w:asciiTheme="majorBidi" w:hAnsiTheme="majorBidi" w:cstheme="majorBidi"/>
+                <w:sz w:val="28"/>
+                <w:szCs w:val="28"/>
+              </w:rPr>
+            </w:pPr>
+            <w:proofErr w:type="spellStart"/>
+            <w:r>
+              <w:rPr>
+                <w:rFonts w:asciiTheme="majorBidi" w:hAnsiTheme="majorBidi" w:cstheme="majorBidi"/>
+                <w:sz w:val="28"/>
+                <w:szCs w:val="28"/>
+              </w:rPr>
+              <w:t>xy</w:t>
+            </w:r>
+            <w:proofErr w:type="spellEnd"/>
+          </w:p>
+        </w:tc>
+        <w:tc>
+          <w:tcPr>
+            <w:tcW w:w="9682" w:type="dxa"/>
+          </w:tcPr>
+          <w:p>
+            <w:pPr>
+              <w:rPr>
+                <w:rFonts w:asciiTheme="majorBidi" w:hAnsiTheme="majorBidi" w:cstheme="majorBidi"/>
+                <w:sz w:val="28"/>
+                <w:szCs w:val="28"/>
+              </w:rPr>
+            </w:pPr>
+          </w:p>
+        </w:tc>
+      </w:tr>
+      <w:tr>
+        <w:tc>
+          <w:tcPr>
+            <w:tcW w:w="846" w:type="dxa"/>
+          </w:tcPr>
+          <w:p>
+            <w:pPr>
+              <w:rPr>
+                <w:rFonts w:asciiTheme="majorBidi" w:hAnsiTheme="majorBidi" w:cstheme="majorBidi"/>
+                <w:sz w:val="28"/>
+                <w:szCs w:val="28"/>
+              </w:rPr>
+            </w:pPr>
+            <w:r>
+              <w:rPr>
+                <w:rFonts w:asciiTheme="majorBidi" w:hAnsiTheme="majorBidi" w:cstheme="majorBidi"/>
+                <w:sz w:val="28"/>
+                <w:szCs w:val="28"/>
+              </w:rPr>
+              <w:t>x</w:t>
+            </w:r>
+          </w:p>
+        </w:tc>
+        <w:tc>
+          <w:tcPr>
+            <w:tcW w:w="9682" w:type="dxa"/>
+          </w:tcPr>
+          <w:p>
+            <w:pPr>
+              <w:rPr>
+                <w:rFonts w:asciiTheme="majorBidi" w:hAnsiTheme="majorBidi" w:cstheme="majorBidi"/>
+                <w:sz w:val="28"/>
+                <w:szCs w:val="28"/>
+              </w:rPr>
+            </w:pPr>
+          </w:p>
+        </w:tc>
+      </w:tr>
+      <w:tr>
+        <w:tc>
+          <w:tcPr>
+            <w:tcW w:w="846" w:type="dxa"/>
+          </w:tcPr>
+          <w:p>
+            <w:pPr>
+              <w:rPr>
+                <w:rFonts w:asciiTheme="majorBidi" w:hAnsiTheme="majorBidi" w:cstheme="majorBidi"/>
+                <w:sz w:val="28"/>
+                <w:szCs w:val="28"/>
+              </w:rPr>
+            </w:pPr>
+            <w:r>
+              <w:rPr>
+                <w:rFonts w:asciiTheme="majorBidi" w:hAnsiTheme="majorBidi" w:cstheme="majorBidi"/>
+                <w:sz w:val="28"/>
+                <w:szCs w:val="28"/>
+              </w:rPr>
+              <w:t>y</w:t>
+            </w:r>
+          </w:p>
+        </w:tc>
+        <w:tc>
+          <w:tcPr>
+            <w:tcW w:w="9682" w:type="dxa"/>
+          </w:tcPr>
+          <w:p>
+            <w:pPr>
+              <w:rPr>
+                <w:rFonts w:asciiTheme="majorBidi" w:hAnsiTheme="majorBidi" w:cstheme="majorBidi"/>
+                <w:sz w:val="28"/>
+                <w:szCs w:val="28"/>
+              </w:rPr>
+            </w:pPr>
+          </w:p>
+        </w:tc>
+      </w:tr>
+      <w:tr>
+        <w:tc>
+          <w:tcPr>
+            <w:tcW w:w="846" w:type="dxa"/>
+          </w:tcPr>
+          <w:p>
+            <w:pPr>
+              <w:rPr>
+                <w:rFonts w:asciiTheme="majorBidi" w:hAnsiTheme="majorBidi" w:cstheme="majorBidi"/>
+                <w:sz w:val="28"/>
+                <w:szCs w:val="28"/>
+              </w:rPr>
+            </w:pPr>
+          </w:p>
+        </w:tc>
+        <w:tc>
+          <w:tcPr>
+            <w:tcW w:w="9682" w:type="dxa"/>
+          </w:tcPr>
+          <w:p>
+            <w:pPr>
+              <w:rPr>
+                <w:rFonts w:asciiTheme="majorBidi" w:hAnsiTheme="majorBidi" w:cstheme="majorBidi"/>
+                <w:sz w:val="28"/>
+                <w:szCs w:val="28"/>
+              </w:rPr>
+            </w:pPr>
+          </w:p>
+        </w:tc>
+      </w:tr>
+    </w:tbl>
     <w:p>
       <w:pPr>
         <w:rPr>
@@ -1208,6 +1365,25 @@
       <w:spacing w:val="5"/>
     </w:rPr>
   </w:style>
+  <w:style w:type="table" w:styleId="TableGrid">
+    <w:name w:val="Table Grid"/>
+    <w:basedOn w:val="TableNormal"/>
+    <w:uiPriority w:val="39"/>
+    <w:rsid w:val="00DC1AE0"/>
+    <w:pPr>
+      <w:spacing w:after="0" w:line="240" w:lineRule="auto"/>
+    </w:pPr>
+    <w:tblPr>
+      <w:tblBorders>
+        <w:top w:val="single" w:sz="4" w:space="0" w:color="auto"/>
+        <w:left w:val="single" w:sz="4" w:space="0" w:color="auto"/>
+        <w:bottom w:val="single" w:sz="4" w:space="0" w:color="auto"/>
+        <w:right w:val="single" w:sz="4" w:space="0" w:color="auto"/>
+        <w:insideH w:val="single" w:sz="4" w:space="0" w:color="auto"/>
+        <w:insideV w:val="single" w:sz="4" w:space="0" w:color="auto"/>
+      </w:tblBorders>
+    </w:tblPr>
+  </w:style>
 </w:styles>
 </file>
 

</xml_diff>